<commit_message>
docs: finalize SIH26114 presentation, proposal document, video script and codebase
</commit_message>
<xml_diff>
--- a/SIH Project Proposal.docx
+++ b/SIH Project Proposal.docx
@@ -2178,7 +2178,7 @@
                 <w:color w:val="1E293B"/>
                 <w:sz w:val="17"/>
               </w:rPr>
-              <w:t>62.95 dBA (~63 dBA, Optimal)</w:t>
+              <w:t>62.94 dBA (~63 dBA, Improved Exposure)</w:t>
             </w:r>
           </w:p>
         </w:tc>
@@ -2606,7 +2606,7 @@
         <w:rPr>
           <w:color w:val="1E293B"/>
         </w:rPr>
-        <w:t xml:space="preserve"> Total Reduction = 10.85 + 4.20 = 15.05 dB (~15 dB). Reducing baseline 78 dBA to 62.95 dBA (~63 dBA).</w:t>
+        <w:t xml:space="preserve"> Total Reduction = 10.85 + 4.20 = 15.05 dB (~15 dB). Reducing baseline 78 dBA to 62.94 dBA (~63 dBA, Improved Exposure).</w:t>
       </w:r>
     </w:p>
     <w:p>

</xml_diff>